<commit_message>
atualização de curriculo e habilidades portfolio
</commit_message>
<xml_diff>
--- a/Curriculo Victoria Lopes.docx
+++ b/Curriculo Victoria Lopes.docx
@@ -401,7 +401,7 @@
           <w:sz w:val="22"/>
           <w:shd w:fill="auto" w:val="clear"/>
         </w:rPr>
-        <w:t xml:space="preserve">Tenho conhecimento em HTML, CSS, JavaScript, React JS e Bootstrap5, bem como noção em ferramentas de design, incluindo Adobe Photoshop, Adobe XD, InDesign, Illustrator e Figma. Familiaridade com metodologias Ágeis (Scrum e Kanban) e Git para controle de versão. </w:t>
+        <w:t xml:space="preserve">Tenho conhecimento em HTML, CSS, JavaScript, React JS e Bootstrap5, bem como noção em ferramentas de design, incluindo Adobe Photoshop, Adobe XD, InDesign, Illustrator e Figma. Familiaridade com metodologias ágeis (Scrum e Kanban) e Git para controle de versão. </w:t>
       </w:r>
     </w:p>
     <w:p>
@@ -663,6 +663,9 @@
     </w:p>
     <w:p>
       <w:pPr>
+        <w:tabs>
+          <w:tab w:val="left" w:pos="8378" w:leader="none"/>
+        </w:tabs>
         <w:spacing w:before="0" w:after="0" w:line="276"/>
         <w:ind w:right="0" w:left="0" w:firstLine="0"/>
         <w:jc w:val="left"/>
@@ -696,7 +699,45 @@
           <w:sz w:val="22"/>
           <w:shd w:fill="auto" w:val="clear"/>
         </w:rPr>
-        <w:t xml:space="preserve"> - Curso em Vídeo</w:t>
+        <w:t xml:space="preserve">: Curso em Vídeo</w:t>
+      </w:r>
+    </w:p>
+    <w:p>
+      <w:pPr>
+        <w:spacing w:before="0" w:after="0" w:line="276"/>
+        <w:ind w:right="-72" w:left="0" w:firstLine="0"/>
+        <w:jc w:val="left"/>
+        <w:rPr>
+          <w:rFonts w:ascii="Titillium Web" w:hAnsi="Titillium Web" w:cs="Titillium Web" w:eastAsia="Titillium Web"/>
+          <w:color w:val="303030"/>
+          <w:spacing w:val="0"/>
+          <w:position w:val="0"/>
+          <w:sz w:val="22"/>
+          <w:shd w:fill="auto" w:val="clear"/>
+        </w:rPr>
+      </w:pPr>
+      <w:r>
+        <w:rPr>
+          <w:rFonts w:ascii="Titillium Web" w:hAnsi="Titillium Web" w:cs="Titillium Web" w:eastAsia="Titillium Web"/>
+          <w:b/>
+          <w:color w:val="303030"/>
+          <w:spacing w:val="0"/>
+          <w:position w:val="0"/>
+          <w:sz w:val="22"/>
+          <w:shd w:fill="auto" w:val="clear"/>
+        </w:rPr>
+        <w:t xml:space="preserve">Metodos ágeis</w:t>
+      </w:r>
+      <w:r>
+        <w:rPr>
+          <w:rFonts w:ascii="Titillium Web" w:hAnsi="Titillium Web" w:cs="Titillium Web" w:eastAsia="Titillium Web"/>
+          <w:color w:val="303030"/>
+          <w:spacing w:val="0"/>
+          <w:position w:val="0"/>
+          <w:sz w:val="22"/>
+          <w:shd w:fill="auto" w:val="clear"/>
+        </w:rPr>
+        <w:t xml:space="preserve">: Organização de Equipes Ágeis: os papéis existentes em uma equipe - Alura</w:t>
       </w:r>
     </w:p>
     <w:p>

</xml_diff>